<commit_message>
Doc: Refine Case of Use tables (CU001, CU002, CU003) to show only user-visible flows, fix old system name and update architecture writeup
</commit_message>
<xml_diff>
--- a/Documentacion/Carpeta de Proyecto.docx
+++ b/Documentacion/Carpeta de Proyecto.docx
@@ -6554,10 +6554,7 @@
     </w:p>
     <w:p>
       <w:r>
-        <w:rPr>
-          <w:lang w:val="es-ES"/>
-        </w:rPr>
-        <w:t>Definir, diseñar e implementar la arquitectura base del sistema SysthAct, estableciendo la estructura de capas, el esquema de persistencia, las dependencias entre componentes y el mapa de navegación de la interfaz.</w:t>
+        <w:t>Definir, diseñar e implementar la arquitectura base del sistema Stach, estableciendo la estructura de capas, el esquema de persistencia, las dependencias entre componentes y el mapa de navegación de la interfaz.</w:t>
       </w:r>
     </w:p>
     <w:p>
@@ -7378,91 +7375,13 @@
     <w:p/>
     <w:p>
       <w:r>
-        <w:rPr>
-          <w:szCs w:val="22"/>
-        </w:rPr>
-        <w:t xml:space="preserve">Para las operaciones de escritura (INSERT, UPDATE) el flujo es: GUI → Servicios → BLL → DAL → Acceso → SQL Server. La clase Acceso (Singleton) mantiene la cadena de conexión y expone métodos genéricos </w:t>
-      </w:r>
-      <w:r>
-        <w:rPr>
-          <w:szCs w:val="22"/>
-        </w:rPr>
-        <w:t>Leer (</w:t>
-      </w:r>
-      <w:r>
-        <w:rPr>
-          <w:szCs w:val="22"/>
-        </w:rPr>
-        <w:t xml:space="preserve">) y </w:t>
-      </w:r>
-      <w:r>
-        <w:rPr>
-          <w:szCs w:val="22"/>
-        </w:rPr>
-        <w:t>Escribir (</w:t>
-      </w:r>
-      <w:r>
-        <w:rPr>
-          <w:szCs w:val="22"/>
-        </w:rPr>
-        <w:t>) que reciben la consulta SQL y un</w:t>
-      </w:r>
-      <w:r>
-        <w:rPr>
-          <w:szCs w:val="22"/>
-        </w:rPr>
-        <w:t xml:space="preserve"> arreglo</w:t>
-      </w:r>
-      <w:r>
-        <w:rPr>
-          <w:szCs w:val="22"/>
-        </w:rPr>
-        <w:t xml:space="preserve"> de </w:t>
-      </w:r>
-      <w:r>
-        <w:rPr>
-          <w:szCs w:val="22"/>
-        </w:rPr>
-        <w:t>parámetros de SQL</w:t>
-      </w:r>
-      <w:r>
-        <w:rPr>
-          <w:szCs w:val="22"/>
-        </w:rPr>
-        <w:t>, garantizando el uso de consultas parametrizadas y previniendo inyección SQL.</w:t>
+        <w:t>Para las operaciones de escritura (INSERT, UPDATE), el flujo es: GUI → BLL → DAL (implementando interfaces de Abstracciones) → Acceso → SQL Server. La clase Acceso (en la DAL) expone métodos parametrizados para interactuar con SQL Server de forma segura, garantizando la prevención de inyección SQL.</w:t>
       </w:r>
     </w:p>
     <w:p/>
     <w:p>
       <w:r>
-        <w:rPr>
-          <w:szCs w:val="22"/>
-        </w:rPr>
-        <w:t>Para las operaciones de lectura (SELECT) el flujo retorna un</w:t>
-      </w:r>
-      <w:r>
-        <w:rPr>
-          <w:szCs w:val="22"/>
-        </w:rPr>
-        <w:t xml:space="preserve">a tabla de datos </w:t>
-      </w:r>
-      <w:r>
-        <w:rPr>
-          <w:szCs w:val="22"/>
-        </w:rPr>
-        <w:t>que la DAL mapea a objetos BE antes de devolverlo a la BLL. La GUI nunca recibe un</w:t>
-      </w:r>
-      <w:r>
-        <w:rPr>
-          <w:szCs w:val="22"/>
-        </w:rPr>
-        <w:t>a tabla de datos</w:t>
-      </w:r>
-      <w:r>
-        <w:rPr>
-          <w:szCs w:val="22"/>
-        </w:rPr>
-        <w:t xml:space="preserve"> directamente, siempre trabaja con entidades BE o listas de ellas.</w:t>
+        <w:t>Para las operaciones de lectura (SELECT), el flujo retorna los datos desde la base de datos a través de Acceso y la DAL, la cual los mapea a objetos de entidades BE antes de devolverlos a la BLL y a la GUI. La interfaz gráfica trabaja únicamente con entidades BE o colecciones de ellas, garantizando el desacoplamiento.</w:t>
       </w:r>
     </w:p>
     <w:p>
@@ -8049,30 +7968,8 @@
             <w:hideMark/>
           </w:tcPr>
           <w:p>
-            <w:pPr>
-              <w:pStyle w:val="Sinespaciado"/>
-            </w:pPr>
-            <w:r>
-              <w:t xml:space="preserve">1. </w:t>
-            </w:r>
-            <w:r>
-              <w:t xml:space="preserve">Verificar conexión DB vía Acceso (Singleton). </w:t>
-            </w:r>
-          </w:p>
-          <w:p>
-            <w:pPr>
-              <w:pStyle w:val="Sinespaciado"/>
-            </w:pPr>
-            <w:r>
-              <w:t xml:space="preserve">2. Si falla: mostrar error y cerrar. </w:t>
-            </w:r>
-          </w:p>
-          <w:p>
-            <w:pPr>
-              <w:pStyle w:val="Sinespaciado"/>
-            </w:pPr>
-            <w:r>
-              <w:t>3. Presentar formulario Login.</w:t>
+            <w:r>
+              <w:t>1. Verificar conexión a base de datos vía IConexionService (IoCContainer). 2. Si falla: mostrar mensaje de error y cerrar la aplicación. 3. Presentar formulario de Login.</w:t>
             </w:r>
           </w:p>
         </w:tc>
@@ -9054,54 +8951,8 @@
             <w:gridSpan w:val="2"/>
           </w:tcPr>
           <w:p>
-            <w:pPr>
-              <w:pStyle w:val="Sinespaciado"/>
-            </w:pPr>
-            <w:r>
-              <w:t>1. El usuario ingresa su nombre de usuario.</w:t>
-            </w:r>
-          </w:p>
-          <w:p>
-            <w:pPr>
-              <w:pStyle w:val="Sinespaciado"/>
-            </w:pPr>
-            <w:r>
-              <w:t xml:space="preserve">2. El usuario ingresa su contraseña. </w:t>
-            </w:r>
-          </w:p>
-          <w:p>
-            <w:pPr>
-              <w:pStyle w:val="Sinespaciado"/>
-            </w:pPr>
-            <w:r>
-              <w:t xml:space="preserve">3. El usuario presiona el botón "Ingresar". </w:t>
-            </w:r>
-          </w:p>
-          <w:p>
-            <w:pPr>
-              <w:pStyle w:val="Sinespaciado"/>
-            </w:pPr>
-            <w:r>
-              <w:t xml:space="preserve">4. El sistema valida las credenciales. </w:t>
-            </w:r>
-          </w:p>
-          <w:p>
-            <w:pPr>
-              <w:pStyle w:val="Sinespaciado"/>
-            </w:pPr>
-            <w:r>
-              <w:t>5. El sistema muestra el mensaje "Bienvenido {username}".</w:t>
-            </w:r>
-          </w:p>
-          <w:p>
-            <w:pPr>
-              <w:pStyle w:val="Sinespaciado"/>
-            </w:pPr>
-            <w:r>
-              <w:t>6</w:t>
-            </w:r>
-            <w:r>
-              <w:t>. El sistema muestra el menú principal.</w:t>
+            <w:r>
+              <w:t>1. El usuario accede al sistema. 2. El sistema muestra el formulario de Login. 3. El usuario ingresa las credenciales y presiona 'Ingresar'. 4. El sistema oculta el formulario de Login y muestra el formulario del Menú Principal.</w:t>
             </w:r>
           </w:p>
         </w:tc>
@@ -9139,143 +8990,8 @@
             <w:gridSpan w:val="2"/>
           </w:tcPr>
           <w:p>
-            <w:pPr>
-              <w:pStyle w:val="Sinespaciado"/>
-            </w:pPr>
-            <w:r>
-              <w:t>4.1.1. Uno o ambos campos están vacíos.</w:t>
-            </w:r>
-          </w:p>
-          <w:p>
-            <w:pPr>
-              <w:pStyle w:val="Sinespaciado"/>
-            </w:pPr>
-            <w:r>
-              <w:t>4.1.2. El sistema muestra el mensaje "Credenciales incompletas".</w:t>
-            </w:r>
-          </w:p>
-          <w:p>
-            <w:pPr>
-              <w:pStyle w:val="Sinespaciado"/>
-            </w:pPr>
-            <w:r>
-              <w:t>4.1.3. Retorna al paso 1.</w:t>
-            </w:r>
-          </w:p>
-          <w:p>
-            <w:pPr>
-              <w:pStyle w:val="Sinespaciado"/>
-            </w:pPr>
-          </w:p>
-          <w:p>
-            <w:pPr>
-              <w:pStyle w:val="Sinespaciado"/>
-            </w:pPr>
-            <w:r>
-              <w:t>4.2.1. Las credenciales ingresadas son incorrectas.</w:t>
-            </w:r>
-          </w:p>
-          <w:p>
-            <w:pPr>
-              <w:pStyle w:val="Sinespaciado"/>
-            </w:pPr>
-            <w:r>
-              <w:t>4.2.2. El sistema muestra el mensaje "Usuario o contraseña incorrectos".</w:t>
-            </w:r>
-          </w:p>
-          <w:p>
-            <w:pPr>
-              <w:pStyle w:val="Sinespaciado"/>
-            </w:pPr>
-            <w:r>
-              <w:t>4.2.3. Retorna al paso 1.</w:t>
-            </w:r>
-          </w:p>
-          <w:p>
-            <w:pPr>
-              <w:pStyle w:val="Sinespaciado"/>
-            </w:pPr>
-          </w:p>
-          <w:p>
-            <w:pPr>
-              <w:pStyle w:val="Sinespaciado"/>
-            </w:pPr>
-            <w:r>
-              <w:t>4.2.1.1. El usuario falla por tercera vez consecutiva.</w:t>
-            </w:r>
-          </w:p>
-          <w:p>
-            <w:pPr>
-              <w:pStyle w:val="Sinespaciado"/>
-            </w:pPr>
-            <w:r>
-              <w:t>4.2.1.2. El sistema muestra el mensaje "Usuario bloqueado. Intente nuevamente en 15 minutos".</w:t>
-            </w:r>
-          </w:p>
-          <w:p>
-            <w:pPr>
-              <w:pStyle w:val="Sinespaciado"/>
-            </w:pPr>
-            <w:r>
-              <w:t>4.2.1.3. El flujo finaliza.</w:t>
-            </w:r>
-          </w:p>
-          <w:p>
-            <w:pPr>
-              <w:pStyle w:val="Sinespaciado"/>
-            </w:pPr>
-          </w:p>
-          <w:p>
-            <w:pPr>
-              <w:pStyle w:val="Sinespaciado"/>
-            </w:pPr>
-            <w:r>
-              <w:t>4.3.1. El usuario existe, las credenciales son correctas, pero la cuenta está bloqueada.</w:t>
-            </w:r>
-          </w:p>
-          <w:p>
-            <w:pPr>
-              <w:pStyle w:val="Sinespaciado"/>
-            </w:pPr>
-            <w:r>
-              <w:t>4.3.2. El sistema muestra el mensaje "Usuario bloqueado. Intente nuevamente en 15 minutos".</w:t>
-            </w:r>
-          </w:p>
-          <w:p>
-            <w:pPr>
-              <w:pStyle w:val="Sinespaciado"/>
-            </w:pPr>
-            <w:r>
-              <w:t>4.3.3. El flujo finaliza.</w:t>
-            </w:r>
-          </w:p>
-          <w:p>
-            <w:pPr>
-              <w:pStyle w:val="Sinespaciado"/>
-            </w:pPr>
-          </w:p>
-          <w:p>
-            <w:pPr>
-              <w:pStyle w:val="Sinespaciado"/>
-            </w:pPr>
-            <w:r>
-              <w:t>4.4.1. El usuario existe, las credenciales son correctas, pero la cuenta está inactiva.</w:t>
-            </w:r>
-          </w:p>
-          <w:p>
-            <w:pPr>
-              <w:pStyle w:val="Sinespaciado"/>
-            </w:pPr>
-            <w:r>
-              <w:t>4.4.2. El sistema muestra el mensaje "Usuario inactivo. Contacte al administrador".</w:t>
-            </w:r>
-          </w:p>
-          <w:p>
-            <w:pPr>
-              <w:pStyle w:val="Sinespaciado"/>
-            </w:pPr>
-            <w:r>
-              <w:t>4.4.3. El flujo finaliza.</w:t>
+            <w:r>
+              <w:t>3.1. El usuario ingresa credenciales incorrectas. 3.2. El sistema muestra el mensaje 'Usuario o contraseña incorrectos'. 3.3. Retorna al paso 3.  3.4. El usuario ingresa credenciales vacías. 3.5. El sistema muestra el mensaje 'Credenciales incompletas'. 3.6. Retorna al paso 3.  3.7. El usuario realiza tres intentos fallidos consecutivos. 3.8. El sistema muestra el mensaje 'Usuario bloqueado. Intente nuevamente en 15 minutos'. 3.9. El flujo finaliza.  3.10. El usuario intenta ingresar con una cuenta inactiva. 3.11. El sistema muestra el mensaje 'Usuario inactivo. Contacte al administrador'. 3.12. El flujo finaliza.</w:t>
             </w:r>
           </w:p>
         </w:tc>
@@ -9690,47 +9406,8 @@
             <w:gridSpan w:val="2"/>
           </w:tcPr>
           <w:p>
-            <w:pPr>
-              <w:pStyle w:val="Sinespaciado"/>
-            </w:pPr>
-            <w:r>
-              <w:t xml:space="preserve">1. El usuario selecciona la opción "Cerrar Sesión" desde el menú principal. </w:t>
-            </w:r>
-          </w:p>
-          <w:p>
-            <w:pPr>
-              <w:pStyle w:val="Sinespaciado"/>
-            </w:pPr>
-            <w:r>
-              <w:t xml:space="preserve">2. El sistema solicita confirmación al usuario. </w:t>
-            </w:r>
-          </w:p>
-          <w:p>
-            <w:pPr>
-              <w:pStyle w:val="Sinespaciado"/>
-            </w:pPr>
-            <w:r>
-              <w:t xml:space="preserve">3. El usuario confirma el cierre de sesión. </w:t>
-            </w:r>
-          </w:p>
-          <w:p>
-            <w:pPr>
-              <w:pStyle w:val="Sinespaciado"/>
-            </w:pPr>
-            <w:r>
-              <w:t xml:space="preserve">4. El sistema cierra la sesión y </w:t>
-            </w:r>
-            <w:r>
-              <w:t>reinicia</w:t>
-            </w:r>
-            <w:r>
-              <w:t xml:space="preserve"> la </w:t>
-            </w:r>
-            <w:r>
-              <w:t>aplicación</w:t>
-            </w:r>
-            <w:r>
-              <w:t>.</w:t>
+            <w:r>
+              <w:t>1. El usuario presiona la opción 'Cerrar Sesión'. 2. El sistema muestra un mensaje de confirmación. 3. El usuario confirma la acción. 4. El sistema oculta el menú principal y muestra el formulario de Login.</w:t>
             </w:r>
           </w:p>
         </w:tc>
@@ -9774,27 +9451,8 @@
             <w:gridSpan w:val="2"/>
           </w:tcPr>
           <w:p>
-            <w:pPr>
-              <w:pStyle w:val="Sinespaciado"/>
-            </w:pPr>
-            <w:r>
-              <w:t xml:space="preserve">3.1.1. El usuario cancela la confirmación. </w:t>
-            </w:r>
-          </w:p>
-          <w:p>
-            <w:pPr>
-              <w:pStyle w:val="Sinespaciado"/>
-            </w:pPr>
-            <w:r>
-              <w:t xml:space="preserve">3.1.2. El sistema retorna al menú principal. </w:t>
-            </w:r>
-          </w:p>
-          <w:p>
-            <w:pPr>
-              <w:pStyle w:val="Sinespaciado"/>
-            </w:pPr>
-            <w:r>
-              <w:t>3.1.3. El flujo finaliza.</w:t>
+            <w:r>
+              <w:t>3.1. El usuario cancela la confirmación. 3.2. El sistema cierra el diálogo y conserva el menú principal activo. 3.3. El flujo finaliza.</w:t>
             </w:r>
           </w:p>
         </w:tc>
@@ -12286,43 +11944,8 @@
             <w:gridSpan w:val="2"/>
           </w:tcPr>
           <w:p>
-            <w:pPr>
-              <w:pStyle w:val="Sinespaciado"/>
-            </w:pPr>
-            <w:r>
-              <w:t xml:space="preserve">1. El usuario selecciona la opción "Bitácora" desde el menú principal. </w:t>
-            </w:r>
-          </w:p>
-          <w:p>
-            <w:pPr>
-              <w:pStyle w:val="Sinespaciado"/>
-            </w:pPr>
-            <w:r>
-              <w:t xml:space="preserve">2. El sistema muestra el formulario de Bitácora con todos los registros cargados. </w:t>
-            </w:r>
-          </w:p>
-          <w:p>
-            <w:pPr>
-              <w:pStyle w:val="Sinespaciado"/>
-            </w:pPr>
-            <w:r>
-              <w:t xml:space="preserve">3. El usuario aplica uno o más filtros (texto libre, criticidad, actividad, exitoso, rango de fechas). </w:t>
-            </w:r>
-          </w:p>
-          <w:p>
-            <w:pPr>
-              <w:pStyle w:val="Sinespaciado"/>
-            </w:pPr>
-            <w:r>
-              <w:t xml:space="preserve">4. El sistema actualiza la grilla mostrando solo los registros que coinciden con los filtros. </w:t>
-            </w:r>
-          </w:p>
-          <w:p>
-            <w:pPr>
-              <w:pStyle w:val="Sinespaciado"/>
-            </w:pPr>
-            <w:r>
-              <w:t>5. El usuario visualiza los resultados.</w:t>
+            <w:r>
+              <w:t>1. El usuario selecciona la opción 'Bitácora' en el menú principal. 2. El sistema muestra el formulario de Bitácora con la grilla de registros. 3. El usuario ingresa o selecciona los criterios de filtrado. 4. El sistema actualiza la grilla mostrando los registros que coinciden con los filtros aplicados.</w:t>
             </w:r>
           </w:p>
         </w:tc>
@@ -12359,179 +11982,8 @@
             <w:gridSpan w:val="2"/>
           </w:tcPr>
           <w:p>
-            <w:pPr>
-              <w:pStyle w:val="Sinespaciado"/>
-            </w:pPr>
-            <w:r>
-              <w:t xml:space="preserve">2.1.1. No existen registros en la bitácora. </w:t>
-            </w:r>
-          </w:p>
-          <w:p>
-            <w:pPr>
-              <w:pStyle w:val="Sinespaciado"/>
-            </w:pPr>
-            <w:r>
-              <w:t xml:space="preserve">2.1.2. El sistema muestra la grilla vacía sin mensaje de error. </w:t>
-            </w:r>
-          </w:p>
-          <w:p>
-            <w:pPr>
-              <w:pStyle w:val="Sinespaciado"/>
-            </w:pPr>
-            <w:r>
-              <w:t xml:space="preserve">2.1.3. Continúa desde el paso 3.  </w:t>
-            </w:r>
-          </w:p>
-          <w:p>
-            <w:pPr>
-              <w:pStyle w:val="Sinespaciado"/>
-            </w:pPr>
-          </w:p>
-          <w:p>
-            <w:pPr>
-              <w:pStyle w:val="Sinespaciado"/>
-            </w:pPr>
-            <w:r>
-              <w:t xml:space="preserve">2.2.1. Ocurre un error al consultar la base de datos. </w:t>
-            </w:r>
-          </w:p>
-          <w:p>
-            <w:pPr>
-              <w:pStyle w:val="Sinespaciado"/>
-            </w:pPr>
-            <w:r>
-              <w:t xml:space="preserve">2.2.2. El sistema muestra un mensaje de error. </w:t>
-            </w:r>
-          </w:p>
-          <w:p>
-            <w:pPr>
-              <w:pStyle w:val="Sinespaciado"/>
-            </w:pPr>
-            <w:r>
-              <w:t xml:space="preserve">2.2.3. El flujo finaliza.  </w:t>
-            </w:r>
-          </w:p>
-          <w:p>
-            <w:pPr>
-              <w:pStyle w:val="Sinespaciado"/>
-            </w:pPr>
-          </w:p>
-          <w:p>
-            <w:pPr>
-              <w:pStyle w:val="Sinespaciado"/>
-            </w:pPr>
-            <w:r>
-              <w:t xml:space="preserve">3.1.1. El usuario presiona el botón "Buscar". </w:t>
-            </w:r>
-          </w:p>
-          <w:p>
-            <w:pPr>
-              <w:pStyle w:val="Sinespaciado"/>
-            </w:pPr>
-            <w:r>
-              <w:t xml:space="preserve">3.1.2. El sistema recarga todos los registros desde la base de datos aplicando los filtros activos. </w:t>
-            </w:r>
-          </w:p>
-          <w:p>
-            <w:pPr>
-              <w:pStyle w:val="Sinespaciado"/>
-            </w:pPr>
-            <w:r>
-              <w:t xml:space="preserve">3.1.3. Continúa desde el paso 4. </w:t>
-            </w:r>
-          </w:p>
-          <w:p>
-            <w:pPr>
-              <w:pStyle w:val="Sinespaciado"/>
-            </w:pPr>
-            <w:r>
-              <w:t xml:space="preserve"> </w:t>
-            </w:r>
-          </w:p>
-          <w:p>
-            <w:pPr>
-              <w:pStyle w:val="Sinespaciado"/>
-            </w:pPr>
-            <w:r>
-              <w:t xml:space="preserve">3.1.1.1. Ocurre un error al recargar desde la base de datos. </w:t>
-            </w:r>
-          </w:p>
-          <w:p>
-            <w:pPr>
-              <w:pStyle w:val="Sinespaciado"/>
-            </w:pPr>
-            <w:r>
-              <w:t xml:space="preserve">3.1.1.2. El sistema muestra un mensaje de error y conserva los datos ya mostrados. </w:t>
-            </w:r>
-          </w:p>
-          <w:p>
-            <w:pPr>
-              <w:pStyle w:val="Sinespaciado"/>
-            </w:pPr>
-            <w:r>
-              <w:t xml:space="preserve">3.1.1.3. Continúa desde el paso 3.  </w:t>
-            </w:r>
-          </w:p>
-          <w:p>
-            <w:pPr>
-              <w:pStyle w:val="Sinespaciado"/>
-            </w:pPr>
-          </w:p>
-          <w:p>
-            <w:pPr>
-              <w:pStyle w:val="Sinespaciado"/>
-            </w:pPr>
-            <w:r>
-              <w:t xml:space="preserve">3.2.1. El usuario presiona el botón "Limpiar". </w:t>
-            </w:r>
-          </w:p>
-          <w:p>
-            <w:pPr>
-              <w:pStyle w:val="Sinespaciado"/>
-            </w:pPr>
-            <w:r>
-              <w:lastRenderedPageBreak/>
-              <w:t xml:space="preserve">3.2.2. El sistema limpia todos los filtros y muestra la totalidad de los registros cargados. </w:t>
-            </w:r>
-          </w:p>
-          <w:p>
-            <w:pPr>
-              <w:pStyle w:val="Sinespaciado"/>
-            </w:pPr>
-            <w:r>
-              <w:t>3.2.3. Continúa desde el paso 3.</w:t>
-            </w:r>
-          </w:p>
-          <w:p>
-            <w:pPr>
-              <w:pStyle w:val="Sinespaciado"/>
-            </w:pPr>
-            <w:r>
-              <w:t xml:space="preserve">  </w:t>
-            </w:r>
-          </w:p>
-          <w:p>
-            <w:pPr>
-              <w:pStyle w:val="Sinespaciado"/>
-            </w:pPr>
-            <w:r>
-              <w:t xml:space="preserve">4.1.1. Ningún registro coincide con los filtros aplicados. </w:t>
-            </w:r>
-          </w:p>
-          <w:p>
-            <w:pPr>
-              <w:pStyle w:val="Sinespaciado"/>
-            </w:pPr>
-            <w:r>
-              <w:t xml:space="preserve">4.1.2. El sistema muestra la grilla vacía. </w:t>
-            </w:r>
-          </w:p>
-          <w:p>
-            <w:pPr>
-              <w:pStyle w:val="Sinespaciado"/>
-            </w:pPr>
-            <w:r>
-              <w:t>4.1.3. Continúa desde el paso 3.</w:t>
+            <w:r>
+              <w:t>3.1. El usuario presiona el botón 'Limpiar'. 3.2. El sistema vacía los filtros y muestra todos los registros en la grilla. 3.3. Retorna al paso 3.  3.4. Ningún registro coincide con los criterios. 3.5. El sistema muestra la grilla vacía. 3.6. Continúa en el paso 3.  3.7. Ocurre un error al consultar los datos. 3.8. El sistema muestra un mensaje de error. 3.9. El flujo finaliza.</w:t>
             </w:r>
           </w:p>
         </w:tc>

</xml_diff>

<commit_message>
Doc: Format Case of Use steps in tables (CU001, CU002, CU003) to use separate paragraphs instead of single-line strings
</commit_message>
<xml_diff>
--- a/Documentacion/Carpeta de Proyecto.docx
+++ b/Documentacion/Carpeta de Proyecto.docx
@@ -8952,7 +8952,13 @@
           </w:tcPr>
           <w:p>
             <w:r>
-              <w:t>1. El usuario accede al sistema. 2. El sistema muestra el formulario de Login. 3. El usuario ingresa las credenciales y presiona 'Ingresar'. 4. El sistema oculta el formulario de Login y muestra el formulario del Menú Principal.</w:t>
+              <w:t>1. El usuario accede al sistema.</w:t>
+              <w:br/>
+              <w:t>2. El sistema muestra el formulario de Login.</w:t>
+              <w:br/>
+              <w:t>3. El usuario ingresa las credenciales y presiona 'Ingresar'.</w:t>
+              <w:br/>
+              <w:t>4. El sistema oculta el formulario de Login y muestra el formulario del Menú Principal.</w:t>
             </w:r>
           </w:p>
         </w:tc>
@@ -8991,7 +8997,29 @@
           </w:tcPr>
           <w:p>
             <w:r>
-              <w:t>3.1. El usuario ingresa credenciales incorrectas. 3.2. El sistema muestra el mensaje 'Usuario o contraseña incorrectos'. 3.3. Retorna al paso 3.  3.4. El usuario ingresa credenciales vacías. 3.5. El sistema muestra el mensaje 'Credenciales incompletas'. 3.6. Retorna al paso 3.  3.7. El usuario realiza tres intentos fallidos consecutivos. 3.8. El sistema muestra el mensaje 'Usuario bloqueado. Intente nuevamente en 15 minutos'. 3.9. El flujo finaliza.  3.10. El usuario intenta ingresar con una cuenta inactiva. 3.11. El sistema muestra el mensaje 'Usuario inactivo. Contacte al administrador'. 3.12. El flujo finaliza.</w:t>
+              <w:t>3.1. El usuario ingresa credenciales incorrectas.</w:t>
+              <w:br/>
+              <w:t>3.2. El sistema muestra el mensaje 'Usuario o contraseña incorrectos'.</w:t>
+              <w:br/>
+              <w:t>3.3. Retorna al paso 3.</w:t>
+              <w:br/>
+              <w:t>3.4. El usuario ingresa credenciales vacías.</w:t>
+              <w:br/>
+              <w:t>3.5. El sistema muestra el mensaje 'Credenciales incompletas'.</w:t>
+              <w:br/>
+              <w:t>3.6. Retorna al paso 3.</w:t>
+              <w:br/>
+              <w:t>3.7. El usuario realiza tres intentos fallidos consecutivos.</w:t>
+              <w:br/>
+              <w:t>3.8. El sistema muestra el mensaje 'Usuario bloqueado. Intente nuevamente en 15 minutos'.</w:t>
+              <w:br/>
+              <w:t>3.9. El flujo finaliza.</w:t>
+              <w:br/>
+              <w:t>3.10. El usuario intenta ingresar con una cuenta inactiva.</w:t>
+              <w:br/>
+              <w:t>3.11. El sistema muestra el mensaje 'Usuario inactivo. Contacte al administrador'.</w:t>
+              <w:br/>
+              <w:t>3.12. El flujo finaliza.</w:t>
             </w:r>
           </w:p>
         </w:tc>
@@ -9407,7 +9435,13 @@
           </w:tcPr>
           <w:p>
             <w:r>
-              <w:t>1. El usuario presiona la opción 'Cerrar Sesión'. 2. El sistema muestra un mensaje de confirmación. 3. El usuario confirma la acción. 4. El sistema oculta el menú principal y muestra el formulario de Login.</w:t>
+              <w:t>1. El usuario presiona la opción 'Cerrar Sesión'.</w:t>
+              <w:br/>
+              <w:t>2. El sistema muestra un mensaje de confirmación.</w:t>
+              <w:br/>
+              <w:t>3. El usuario confirma la acción.</w:t>
+              <w:br/>
+              <w:t>4. El sistema oculta el menú principal y muestra el formulario de Login.</w:t>
             </w:r>
           </w:p>
         </w:tc>
@@ -9452,7 +9486,11 @@
           </w:tcPr>
           <w:p>
             <w:r>
-              <w:t>3.1. El usuario cancela la confirmación. 3.2. El sistema cierra el diálogo y conserva el menú principal activo. 3.3. El flujo finaliza.</w:t>
+              <w:t>3.1. El usuario cancela la confirmación.</w:t>
+              <w:br/>
+              <w:t>3.2. El sistema cierra el diálogo y conserva el menú principal activo.</w:t>
+              <w:br/>
+              <w:t>3.3. El flujo finaliza.</w:t>
             </w:r>
           </w:p>
         </w:tc>
@@ -11945,7 +11983,13 @@
           </w:tcPr>
           <w:p>
             <w:r>
-              <w:t>1. El usuario selecciona la opción 'Bitácora' en el menú principal. 2. El sistema muestra el formulario de Bitácora con la grilla de registros. 3. El usuario ingresa o selecciona los criterios de filtrado. 4. El sistema actualiza la grilla mostrando los registros que coinciden con los filtros aplicados.</w:t>
+              <w:t>1. El usuario selecciona la opción 'Bitácora' en el menú principal.</w:t>
+              <w:br/>
+              <w:t>2. El sistema muestra el formulario de Bitácora con la grilla de registros.</w:t>
+              <w:br/>
+              <w:t>3. El usuario ingresa o selecciona los criterios de filtrado.</w:t>
+              <w:br/>
+              <w:t>4. El sistema actualiza la grilla mostrando los registros que coinciden con los filtros aplicados.</w:t>
             </w:r>
           </w:p>
         </w:tc>
@@ -11983,7 +12027,23 @@
           </w:tcPr>
           <w:p>
             <w:r>
-              <w:t>3.1. El usuario presiona el botón 'Limpiar'. 3.2. El sistema vacía los filtros y muestra todos los registros en la grilla. 3.3. Retorna al paso 3.  3.4. Ningún registro coincide con los criterios. 3.5. El sistema muestra la grilla vacía. 3.6. Continúa en el paso 3.  3.7. Ocurre un error al consultar los datos. 3.8. El sistema muestra un mensaje de error. 3.9. El flujo finaliza.</w:t>
+              <w:t>3.1. El usuario presiona el botón 'Limpiar'.</w:t>
+              <w:br/>
+              <w:t>3.2. El sistema vacía los filtros y muestra todos los registros en la grilla.</w:t>
+              <w:br/>
+              <w:t>3.3. Retorna al paso 3.</w:t>
+              <w:br/>
+              <w:t>3.4. Ningún registro coincide con los criterios.</w:t>
+              <w:br/>
+              <w:t>3.5. El sistema muestra la grilla vacía.</w:t>
+              <w:br/>
+              <w:t>3.6. Continúa en el paso 3.</w:t>
+              <w:br/>
+              <w:t>3.7. Ocurre un error al consultar los datos.</w:t>
+              <w:br/>
+              <w:t>3.8. El sistema muestra un mensaje de error.</w:t>
+              <w:br/>
+              <w:t>3.9. El flujo finaliza.</w:t>
             </w:r>
           </w:p>
         </w:tc>

</xml_diff>

<commit_message>
Doc: Format alternate flows using pure numeric hierarchical tree format (X.Y.Z) in CU001, CU002, and CU003 tables
</commit_message>
<xml_diff>
--- a/Documentacion/Carpeta de Proyecto.docx
+++ b/Documentacion/Carpeta de Proyecto.docx
@@ -257,6 +257,7 @@
                 <w:color w:val="BC1A44"/>
               </w:rPr>
             </w:pPr>
+            <w:proofErr w:type="gramStart"/>
             <w:r>
               <w:rPr>
                 <w:b/>
@@ -278,7 +279,18 @@
                 <w:sz w:val="36"/>
                 <w:szCs w:val="40"/>
               </w:rPr>
-              <w:t xml:space="preserve">Stach </w:t>
+              <w:t>Stach</w:t>
+            </w:r>
+            <w:proofErr w:type="gramEnd"/>
+            <w:r>
+              <w:rPr>
+                <w:b/>
+                <w:bCs/>
+                <w:color w:val="BC1A44"/>
+                <w:sz w:val="36"/>
+                <w:szCs w:val="40"/>
+              </w:rPr>
+              <w:t xml:space="preserve"> </w:t>
             </w:r>
             <w:r>
               <w:rPr>
@@ -8142,7 +8154,15 @@
               <w:t xml:space="preserve"> </w:t>
             </w:r>
             <w:r>
-              <w:t>Login y resetear Intentos</w:t>
+              <w:t xml:space="preserve">Login y </w:t>
+            </w:r>
+            <w:proofErr w:type="gramStart"/>
+            <w:r>
+              <w:t>resetear</w:t>
+            </w:r>
+            <w:proofErr w:type="gramEnd"/>
+            <w:r>
+              <w:t xml:space="preserve"> Intentos</w:t>
             </w:r>
             <w:r>
               <w:t xml:space="preserve"> </w:t>
@@ -9024,6 +9044,9 @@
             <w:gridSpan w:val="2"/>
           </w:tcPr>
           <w:p>
+            <w:pPr>
+              <w:ind w:firstLine="0"/>
+            </w:pPr>
             <w:r>
               <w:t>1. El usuario accede al sistema.</w:t>
             </w:r>
@@ -9076,29 +9099,29 @@
           </w:tcPr>
           <w:p>
             <w:r>
-              <w:t>3a. Las credenciales ingresadas son incorrectas:</w:t>
+              <w:t>3.1.1. Las credenciales ingresadas son incorrectas:</w:t>
               <w:br/>
-              <w:t xml:space="preserve">  3a1. El sistema muestra el mensaje 'Usuario o contraseña incorrectos'.</w:t>
+              <w:t>3.1.2. El sistema muestra el mensaje 'Usuario o contraseña incorrectos'.</w:t>
               <w:br/>
-              <w:t xml:space="preserve">  3a2. Retorna al paso 3 del escenario principal.</w:t>
+              <w:t>3.1.3. Retorna al paso 3 del escenario principal.</w:t>
               <w:br/>
-              <w:t>3b. Las credenciales ingresadas están vacías:</w:t>
+              <w:t>3.2.1. Las credenciales ingresadas están vacías:</w:t>
               <w:br/>
-              <w:t xml:space="preserve">  3b1. El sistema muestra el mensaje 'Credenciales incompletas'.</w:t>
+              <w:t>3.2.2. El sistema muestra el mensaje 'Credenciales incompletas'.</w:t>
               <w:br/>
-              <w:t xml:space="preserve">  3b2. Retorna al paso 3 del escenario principal.</w:t>
+              <w:t>3.2.3. Retorna al paso 3 del escenario principal.</w:t>
               <w:br/>
-              <w:t>3c. El usuario realiza tres intentos fallidos consecutivos:</w:t>
+              <w:t>3.3.1. El usuario realiza tres intentos fallidos consecutivos:</w:t>
               <w:br/>
-              <w:t xml:space="preserve">  3c1. El sistema muestra el mensaje 'Usuario bloqueado. Intente nuevamente en 15 minutos'.</w:t>
+              <w:t>3.3.2. El sistema muestra el mensaje 'Usuario bloqueado. Intente nuevamente en 15 minutos'.</w:t>
               <w:br/>
-              <w:t xml:space="preserve">  3c2. El flujo finaliza.</w:t>
+              <w:t>3.3.3. El flujo finaliza.</w:t>
               <w:br/>
-              <w:t>3d. El usuario intenta ingresar con una cuenta inactiva:</w:t>
+              <w:t>3.4.1. El usuario intenta ingresar con una cuenta inactiva:</w:t>
               <w:br/>
-              <w:t xml:space="preserve">  3d1. El sistema muestra el mensaje 'Usuario inactivo. Contacte al administrador'.</w:t>
+              <w:t>3.4.2. El sistema muestra el mensaje 'Usuario inactivo. Contacte al administrador'.</w:t>
               <w:br/>
-              <w:t xml:space="preserve">  3d2. El flujo finaliza.</w:t>
+              <w:t>3.4.3. El flujo finaliza.</w:t>
             </w:r>
           </w:p>
         </w:tc>
@@ -9571,11 +9594,11 @@
           </w:tcPr>
           <w:p>
             <w:r>
-              <w:t>3a. El usuario cancela la confirmación:</w:t>
+              <w:t>3.1.1. El usuario cancela la confirmación:</w:t>
               <w:br/>
-              <w:t xml:space="preserve">  3a1. El sistema cierra el diálogo y conserva el menú principal activo.</w:t>
+              <w:t>3.1.2. El sistema cierra el diálogo y conserva el menú principal activo.</w:t>
               <w:br/>
-              <w:t xml:space="preserve">  3a2. El flujo finaliza.</w:t>
+              <w:t>3.1.3. El flujo finaliza.</w:t>
             </w:r>
           </w:p>
         </w:tc>
@@ -10855,7 +10878,15 @@
               <w:pStyle w:val="Sinespaciado"/>
             </w:pPr>
             <w:r>
-              <w:t>Base64 → NVARCHAR(200) en BD</w:t>
+              <w:t xml:space="preserve">Base64 → </w:t>
+            </w:r>
+            <w:proofErr w:type="gramStart"/>
+            <w:r>
+              <w:t>NVARCHAR(</w:t>
+            </w:r>
+            <w:proofErr w:type="gramEnd"/>
+            <w:r>
+              <w:t>200) en BD</w:t>
             </w:r>
           </w:p>
         </w:tc>
@@ -11277,12 +11308,17 @@
         <w:t xml:space="preserve">: Interfaz implementada por los elementos que necesitan actualizar su idioma de forma activa (los formularios de la GUI). Define el método </w:t>
       </w:r>
       <w:proofErr w:type="spellStart"/>
+      <w:proofErr w:type="gramStart"/>
       <w:r>
         <w:t>ActualizarIdioma</w:t>
       </w:r>
       <w:proofErr w:type="spellEnd"/>
       <w:r>
-        <w:t>().</w:t>
+        <w:t>(</w:t>
+      </w:r>
+      <w:proofErr w:type="gramEnd"/>
+      <w:r>
+        <w:t>).</w:t>
       </w:r>
     </w:p>
     <w:p/>
@@ -11343,20 +11379,30 @@
         <w:t xml:space="preserve"> cambia el idioma activo, recarga las traducciones y llama al método </w:t>
       </w:r>
       <w:proofErr w:type="spellStart"/>
+      <w:proofErr w:type="gramStart"/>
       <w:r>
         <w:t>Notify</w:t>
       </w:r>
       <w:proofErr w:type="spellEnd"/>
       <w:r>
-        <w:t xml:space="preserve">(). Este recorre la lista de observadores activos llamando a </w:t>
+        <w:t>(</w:t>
+      </w:r>
+      <w:proofErr w:type="gramEnd"/>
+      <w:r>
+        <w:t xml:space="preserve">). Este recorre la lista de observadores activos llamando a </w:t>
       </w:r>
       <w:proofErr w:type="spellStart"/>
+      <w:proofErr w:type="gramStart"/>
       <w:r>
         <w:t>ActualizarIdioma</w:t>
       </w:r>
       <w:proofErr w:type="spellEnd"/>
       <w:r>
-        <w:t xml:space="preserve">() en cada </w:t>
+        <w:t>(</w:t>
+      </w:r>
+      <w:proofErr w:type="gramEnd"/>
+      <w:r>
+        <w:t xml:space="preserve">) en cada </w:t>
       </w:r>
       <w:r>
         <w:lastRenderedPageBreak/>
@@ -11629,7 +11675,15 @@
         </w:numPr>
       </w:pPr>
       <w:r>
-        <w:t xml:space="preserve">Botón Limpiar: resetea todos los filtros y muestra </w:t>
+        <w:t xml:space="preserve">Botón Limpiar: </w:t>
+      </w:r>
+      <w:proofErr w:type="gramStart"/>
+      <w:r>
+        <w:t>resetea</w:t>
+      </w:r>
+      <w:proofErr w:type="gramEnd"/>
+      <w:r>
+        <w:t xml:space="preserve"> todos los filtros y muestra </w:t>
       </w:r>
       <w:r>
         <w:t xml:space="preserve">la </w:t>
@@ -12268,23 +12322,23 @@
           </w:tcPr>
           <w:p>
             <w:r>
-              <w:t>3a. El usuario presiona el botón 'Limpiar':</w:t>
+              <w:t>3.1.1. El usuario presiona el botón 'Limpiar':</w:t>
               <w:br/>
-              <w:t xml:space="preserve">  3a1. El sistema vacía los filtros y muestra todos los registros en la grilla.</w:t>
+              <w:t>3.1.2. El sistema vacía los filtros y muestra todos los registros en la grilla.</w:t>
               <w:br/>
-              <w:t xml:space="preserve">  3a2. Retorna al paso 3 del escenario principal.</w:t>
+              <w:t>3.1.3. Retorna al paso 3 del escenario principal.</w:t>
               <w:br/>
-              <w:t>3b. Ningún registro coincide con los criterios de filtrado:</w:t>
+              <w:t>3.2.1. Ningún registro coincide con los criterios de filtrado:</w:t>
               <w:br/>
-              <w:t xml:space="preserve">  3b1. El sistema muestra la grilla vacía.</w:t>
+              <w:t>3.2.2. El sistema muestra la grilla vacía.</w:t>
               <w:br/>
-              <w:t xml:space="preserve">  3b2. Continúa en el paso 3 del escenario principal.</w:t>
+              <w:t>3.2.3. Continúa en el paso 3 del escenario principal.</w:t>
               <w:br/>
-              <w:t>4a. Ocurre un error al consultar los datos:</w:t>
+              <w:t>4.1.1. Ocurre un error al consultar los datos:</w:t>
               <w:br/>
-              <w:t xml:space="preserve">  4a1. El sistema muestra un mensaje de error.</w:t>
+              <w:t>4.1.2. El sistema muestra un mensaje de error.</w:t>
               <w:br/>
-              <w:t xml:space="preserve">  4a2. El flujo finaliza.</w:t>
+              <w:t>4.1.3. El flujo finaliza.</w:t>
             </w:r>
           </w:p>
         </w:tc>
@@ -12596,13 +12650,18 @@
     <w:p/>
     <w:p>
       <w:r>
-        <w:t xml:space="preserve">1. Generación de Copia de Seguridad: El sistema solicita una contraseña privada al administrador. Se realiza un </w:t>
+        <w:t xml:space="preserve">1. Generación de Copia de Seguridad: El sistema solicita una contraseña privada al administrador. Se realiza </w:t>
+      </w:r>
+      <w:proofErr w:type="gramStart"/>
+      <w:r>
+        <w:t xml:space="preserve">un </w:t>
       </w:r>
       <w:proofErr w:type="spellStart"/>
       <w:r>
         <w:t>backup</w:t>
       </w:r>
       <w:proofErr w:type="spellEnd"/>
+      <w:proofErr w:type="gramEnd"/>
       <w:r>
         <w:t xml:space="preserve"> nativo de SQL Server hacia un archivo .</w:t>
       </w:r>
@@ -12694,13 +12753,26 @@
       </w:r>
       <w:proofErr w:type="spellEnd"/>
       <w:r>
-        <w:t xml:space="preserve"> API) de Windows. Esta clave permite a un administrador saltar (bypass) la validación de base de datos ante errores graves de conexión o integridad y acceder directamente a restaurar un </w:t>
+        <w:t xml:space="preserve"> API) de Windows. Esta clave permite a un administrador saltar (</w:t>
+      </w:r>
+      <w:proofErr w:type="gramStart"/>
+      <w:r>
+        <w:t>bypass</w:t>
+      </w:r>
+      <w:proofErr w:type="gramEnd"/>
+      <w:r>
+        <w:t xml:space="preserve">) la validación de base de datos ante errores graves de conexión o integridad y acceder directamente a restaurar </w:t>
+      </w:r>
+      <w:proofErr w:type="gramStart"/>
+      <w:r>
+        <w:t xml:space="preserve">un </w:t>
       </w:r>
       <w:proofErr w:type="spellStart"/>
       <w:r>
         <w:t>backup</w:t>
       </w:r>
       <w:proofErr w:type="spellEnd"/>
+      <w:proofErr w:type="gramEnd"/>
       <w:r>
         <w:t xml:space="preserve"> íntegro.</w:t>
       </w:r>

</xml_diff>

<commit_message>
Refactor: Resolucion de advertencias de analisis estatico de SonarQube y optimizaciones de codigo limpio
</commit_message>
<xml_diff>
--- a/Documentacion/Carpeta de Proyecto.docx
+++ b/Documentacion/Carpeta de Proyecto.docx
@@ -4,7 +4,7 @@
   <w:body>
     <w:p>
       <w:pPr>
-        <w:ind w:left="720" w:firstLine="0"/>
+        <w:ind w:left="2160" w:hanging="1440"/>
       </w:pPr>
       <w:r>
         <w:rPr>
@@ -257,7 +257,6 @@
                 <w:color w:val="BC1A44"/>
               </w:rPr>
             </w:pPr>
-            <w:proofErr w:type="gramStart"/>
             <w:r>
               <w:rPr>
                 <w:b/>
@@ -279,18 +278,7 @@
                 <w:sz w:val="36"/>
                 <w:szCs w:val="40"/>
               </w:rPr>
-              <w:t>Stach</w:t>
-            </w:r>
-            <w:proofErr w:type="gramEnd"/>
-            <w:r>
-              <w:rPr>
-                <w:b/>
-                <w:bCs/>
-                <w:color w:val="BC1A44"/>
-                <w:sz w:val="36"/>
-                <w:szCs w:val="40"/>
-              </w:rPr>
-              <w:t xml:space="preserve"> </w:t>
+              <w:t xml:space="preserve">Stach </w:t>
             </w:r>
             <w:r>
               <w:rPr>
@@ -636,6 +624,7 @@
     <w:p>
       <w:pPr>
         <w:pStyle w:val="TtuloTDC"/>
+        <w:ind w:left="720" w:hanging="720"/>
         <w:rPr>
           <w:lang w:val="es-AR"/>
         </w:rPr>
@@ -6004,23 +5993,7 @@
           </w:tcPr>
           <w:p>
             <w:r>
-              <w:t xml:space="preserve">2da Entrega. Reestructuración de 6 capas, desacoplamiento absoluto de GUI y Servicios con </w:t>
-            </w:r>
-            <w:proofErr w:type="spellStart"/>
-            <w:r>
-              <w:t>IoC</w:t>
-            </w:r>
-            <w:proofErr w:type="spellEnd"/>
-            <w:r>
-              <w:t xml:space="preserve"> global, clave de recuperación maestra (DPAPI), cifrado de </w:t>
-            </w:r>
-            <w:proofErr w:type="spellStart"/>
-            <w:r>
-              <w:t>backups</w:t>
-            </w:r>
-            <w:proofErr w:type="spellEnd"/>
-            <w:r>
-              <w:t xml:space="preserve"> AES-256 e integridad con dígitos verificadores (DVH/DVV).</w:t>
+              <w:t>2da Entrega. Reestructuración de 6 capas, desacoplamiento absoluto de GUI y Servicios con IoC global, clave de recuperación maestra (DPAPI), cifrado de backups AES-256 e integridad con dígitos verificadores (DVH/DVV).</w:t>
             </w:r>
           </w:p>
         </w:tc>
@@ -6773,15 +6746,7 @@
           </w:tcPr>
           <w:p>
             <w:r>
-              <w:t xml:space="preserve">Contiene todas las interfaces (contratos) y tipos abstractos necesarios para desacoplar las capas, incluyendo el componente global </w:t>
-            </w:r>
-            <w:proofErr w:type="spellStart"/>
-            <w:r>
-              <w:t>IoCContainer</w:t>
-            </w:r>
-            <w:proofErr w:type="spellEnd"/>
-            <w:r>
-              <w:t>.</w:t>
+              <w:t>Contiene todas las interfaces (contratos) y tipos abstractos necesarios para desacoplar las capas, incluyendo el componente global IoCContainer.</w:t>
             </w:r>
           </w:p>
         </w:tc>
@@ -6856,15 +6821,7 @@
           </w:tcPr>
           <w:p>
             <w:r>
-              <w:t>Servicios (Cross-</w:t>
-            </w:r>
-            <w:proofErr w:type="spellStart"/>
-            <w:r>
-              <w:t>cutting</w:t>
-            </w:r>
-            <w:proofErr w:type="spellEnd"/>
-            <w:r>
-              <w:t>)</w:t>
+              <w:t>Servicios (Cross-cutting)</w:t>
             </w:r>
           </w:p>
         </w:tc>
@@ -6887,15 +6844,7 @@
           </w:tcPr>
           <w:p>
             <w:r>
-              <w:t xml:space="preserve">Capa transversal que implementa los servicios comunes del sistema (cifrado AES-256/PBKDF2, copias de seguridad, </w:t>
-            </w:r>
-            <w:proofErr w:type="spellStart"/>
-            <w:r>
-              <w:t>multiidioma</w:t>
-            </w:r>
-            <w:proofErr w:type="spellEnd"/>
-            <w:r>
-              <w:t xml:space="preserve"> con Observer, auditoría de bitácora e integridad por dígitos verificadores).</w:t>
+              <w:t>Capa transversal que implementa los servicios comunes del sistema (cifrado AES-256/PBKDF2, copias de seguridad, multiidioma con Observer, auditoría de bitácora e integridad por dígitos verificadores).</w:t>
             </w:r>
           </w:p>
         </w:tc>
@@ -6969,13 +6918,8 @@
             <w:hideMark/>
           </w:tcPr>
           <w:p>
-            <w:proofErr w:type="spellStart"/>
-            <w:r>
-              <w:t>IoC</w:t>
-            </w:r>
-            <w:proofErr w:type="spellEnd"/>
-            <w:r>
-              <w:t xml:space="preserve"> (Inversión de Control)</w:t>
+            <w:r>
+              <w:t>IoC (Inversión de Control)</w:t>
             </w:r>
           </w:p>
         </w:tc>
@@ -6998,15 +6942,7 @@
           </w:tcPr>
           <w:p>
             <w:r>
-              <w:t>Raíz de composición (</w:t>
-            </w:r>
-            <w:proofErr w:type="spellStart"/>
-            <w:r>
-              <w:t>Composition</w:t>
-            </w:r>
-            <w:proofErr w:type="spellEnd"/>
-            <w:r>
-              <w:t xml:space="preserve"> Root) que registra todas las implementaciones concretas de la solución en el contenedor al arrancar la aplicación.</w:t>
+              <w:t>Raíz de composición (Composition Root) que registra todas las implementaciones concretas de la solución en el contenedor al arrancar la aplicación.</w:t>
             </w:r>
           </w:p>
         </w:tc>
@@ -7668,21 +7604,7 @@
         <w:rPr>
           <w:lang w:val="es-ES"/>
         </w:rPr>
-        <w:t xml:space="preserve">T02. Gestión de Log In / Log </w:t>
-      </w:r>
-      <w:proofErr w:type="spellStart"/>
-      <w:r>
-        <w:rPr>
-          <w:lang w:val="es-ES"/>
-        </w:rPr>
-        <w:t>Out</w:t>
-      </w:r>
-      <w:proofErr w:type="spellEnd"/>
-      <w:r>
-        <w:rPr>
-          <w:lang w:val="es-ES"/>
-        </w:rPr>
-        <w:t xml:space="preserve"> del Sistema</w:t>
+        <w:t>T02. Gestión de Log In / Log Out del Sistema</w:t>
       </w:r>
       <w:bookmarkEnd w:id="58"/>
       <w:bookmarkEnd w:id="59"/>
@@ -8038,23 +7960,7 @@
           </w:tcPr>
           <w:p>
             <w:r>
-              <w:t xml:space="preserve">1. Verificar conexión a base de datos vía </w:t>
-            </w:r>
-            <w:proofErr w:type="spellStart"/>
-            <w:r>
-              <w:t>IConexionService</w:t>
-            </w:r>
-            <w:proofErr w:type="spellEnd"/>
-            <w:r>
-              <w:t xml:space="preserve"> (</w:t>
-            </w:r>
-            <w:proofErr w:type="spellStart"/>
-            <w:r>
-              <w:t>IoCContainer</w:t>
-            </w:r>
-            <w:proofErr w:type="spellEnd"/>
-            <w:r>
-              <w:t>). 2. Si falla: mostrar mensaje de error y cerrar la aplicación. 3. Presentar formulario de Login.</w:t>
+              <w:t>1. Verificar conexión a base de datos vía IConexionService (IoCContainer). 2. Si falla: mostrar mensaje de error y cerrar la aplicación. 3. Presentar formulario de Login.</w:t>
             </w:r>
           </w:p>
         </w:tc>
@@ -8154,15 +8060,7 @@
               <w:t xml:space="preserve"> </w:t>
             </w:r>
             <w:r>
-              <w:t xml:space="preserve">Login y </w:t>
-            </w:r>
-            <w:proofErr w:type="gramStart"/>
-            <w:r>
-              <w:t>resetear</w:t>
-            </w:r>
-            <w:proofErr w:type="gramEnd"/>
-            <w:r>
-              <w:t xml:space="preserve"> Intentos</w:t>
+              <w:t>Login y resetear Intentos</w:t>
             </w:r>
             <w:r>
               <w:t xml:space="preserve"> </w:t>
@@ -9100,26 +8998,48 @@
           <w:p>
             <w:r>
               <w:t>3.1.1. Las credenciales ingresadas son incorrectas:</w:t>
+            </w:r>
+            <w:r>
               <w:br/>
               <w:t>3.1.2. El sistema muestra el mensaje 'Usuario o contraseña incorrectos'.</w:t>
+            </w:r>
+            <w:r>
               <w:br/>
               <w:t>3.1.3. Retorna al paso 3 del escenario principal.</w:t>
+            </w:r>
+            <w:r>
               <w:br/>
               <w:t>3.2.1. Las credenciales ingresadas están vacías:</w:t>
+            </w:r>
+            <w:r>
               <w:br/>
               <w:t>3.2.2. El sistema muestra el mensaje 'Credenciales incompletas'.</w:t>
+            </w:r>
+            <w:r>
               <w:br/>
               <w:t>3.2.3. Retorna al paso 3 del escenario principal.</w:t>
+            </w:r>
+            <w:r>
               <w:br/>
               <w:t>3.3.1. El usuario realiza tres intentos fallidos consecutivos:</w:t>
+            </w:r>
+            <w:r>
               <w:br/>
               <w:t>3.3.2. El sistema muestra el mensaje 'Usuario bloqueado. Intente nuevamente en 15 minutos'.</w:t>
+            </w:r>
+            <w:r>
               <w:br/>
               <w:t>3.3.3. El flujo finaliza.</w:t>
+            </w:r>
+            <w:r>
               <w:br/>
               <w:t>3.4.1. El usuario intenta ingresar con una cuenta inactiva:</w:t>
+            </w:r>
+            <w:r>
               <w:br/>
               <w:t>3.4.2. El sistema muestra el mensaje 'Usuario inactivo. Contacte al administrador'.</w:t>
+            </w:r>
+            <w:r>
               <w:br/>
               <w:t>3.4.3. El flujo finaliza.</w:t>
             </w:r>
@@ -9595,8 +9515,12 @@
           <w:p>
             <w:r>
               <w:t>3.1.1. El usuario cancela la confirmación:</w:t>
+            </w:r>
+            <w:r>
               <w:br/>
               <w:t>3.1.2. El sistema cierra el diálogo y conserva el menú principal activo.</w:t>
+            </w:r>
+            <w:r>
               <w:br/>
               <w:t>3.1.3. El flujo finaliza.</w:t>
             </w:r>
@@ -10109,11 +10033,9 @@
             <w:r>
               <w:t>16 bytes aleatorios (</w:t>
             </w:r>
-            <w:proofErr w:type="spellStart"/>
             <w:r>
               <w:t>RandomNumberGenerator</w:t>
             </w:r>
-            <w:proofErr w:type="spellEnd"/>
             <w:r>
               <w:t>)</w:t>
             </w:r>
@@ -10878,15 +10800,7 @@
               <w:pStyle w:val="Sinespaciado"/>
             </w:pPr>
             <w:r>
-              <w:t xml:space="preserve">Base64 → </w:t>
-            </w:r>
-            <w:proofErr w:type="gramStart"/>
-            <w:r>
-              <w:t>NVARCHAR(</w:t>
-            </w:r>
-            <w:proofErr w:type="gramEnd"/>
-            <w:r>
-              <w:t>200) en BD</w:t>
+              <w:t>Base64 → NVARCHAR(200) en BD</w:t>
             </w:r>
           </w:p>
         </w:tc>
@@ -11110,53 +11024,13 @@
     </w:p>
     <w:p>
       <w:r>
-        <w:t xml:space="preserve">Se implementa el patrón de diseño Composite. Los permisos del sistema se modelan bajo la clase abstracta </w:t>
-      </w:r>
-      <w:proofErr w:type="spellStart"/>
-      <w:r>
-        <w:t>ComponentePermiso</w:t>
-      </w:r>
-      <w:proofErr w:type="spellEnd"/>
-      <w:r>
-        <w:t xml:space="preserve"> (capa BE), la cual define las firmas básicas para agregar o quitar elementos, y expone propiedades como </w:t>
-      </w:r>
-      <w:proofErr w:type="spellStart"/>
-      <w:r>
-        <w:t>IdPermiso</w:t>
-      </w:r>
-      <w:proofErr w:type="spellEnd"/>
-      <w:r>
-        <w:t xml:space="preserve">, Nombre y </w:t>
-      </w:r>
-      <w:proofErr w:type="spellStart"/>
-      <w:r>
-        <w:t>PermisoKey</w:t>
-      </w:r>
-      <w:proofErr w:type="spellEnd"/>
-      <w:r>
-        <w:t>. De esta clase abstracta heredan dos de las implementaciones principales:</w:t>
+        <w:t>Se implementa el patrón de diseño Composite. Los permisos del sistema se modelan bajo la clase abstracta ComponentePermiso (capa BE), la cual define las firmas básicas para agregar o quitar elementos, y expone propiedades como IdPermiso, Nombre y PermisoKey. De esta clase abstracta heredan dos de las implementaciones principales:</w:t>
       </w:r>
     </w:p>
     <w:p/>
     <w:p>
       <w:r>
-        <w:t>1. Patente (</w:t>
-      </w:r>
-      <w:proofErr w:type="spellStart"/>
-      <w:r>
-        <w:t>Leaf</w:t>
-      </w:r>
-      <w:proofErr w:type="spellEnd"/>
-      <w:r>
-        <w:t>): Representa un permiso de granularidad atómica asociado a una función específica del sistema (por ejemplo, 'Usuarios' o '</w:t>
-      </w:r>
-      <w:proofErr w:type="spellStart"/>
-      <w:r>
-        <w:t>Backups</w:t>
-      </w:r>
-      <w:proofErr w:type="spellEnd"/>
-      <w:r>
-        <w:t xml:space="preserve">'). Al ser una hoja en la </w:t>
+        <w:t xml:space="preserve">1. Patente (Leaf): Representa un permiso de granularidad atómica asociado a una función específica del sistema (por ejemplo, 'Usuarios' o 'Backups'). Al ser una hoja en la </w:t>
       </w:r>
       <w:r>
         <w:lastRenderedPageBreak/>
@@ -11166,59 +11040,19 @@
     <w:p/>
     <w:p>
       <w:r>
-        <w:t xml:space="preserve">2. Familia (Composite): Representa un permiso compuesto o rol que puede contener tanto patentes como otras familias de permisos, permitiendo crear jerarquías de roles complejas (por ejemplo, el perfil Administrador que contiene la familia de Gestión de Usuarios y Gestión de </w:t>
-      </w:r>
-      <w:proofErr w:type="spellStart"/>
-      <w:r>
-        <w:t>Backups</w:t>
-      </w:r>
-      <w:proofErr w:type="spellEnd"/>
-      <w:r>
-        <w:t>).</w:t>
+        <w:t>2. Familia (Composite): Representa un permiso compuesto o rol que puede contener tanto patentes como otras familias de permisos, permitiendo crear jerarquías de roles complejas (por ejemplo, el perfil Administrador que contiene la familia de Gestión de Usuarios y Gestión de Backups).</w:t>
       </w:r>
     </w:p>
     <w:p/>
     <w:p>
       <w:r>
-        <w:t xml:space="preserve">La asignación de permisos se vincula directamente entre la entidad Usuario y la clase </w:t>
-      </w:r>
-      <w:proofErr w:type="spellStart"/>
-      <w:r>
-        <w:t>ComponentePermiso</w:t>
-      </w:r>
-      <w:proofErr w:type="spellEnd"/>
-      <w:r>
-        <w:t xml:space="preserve"> (relación de muchos a muchos). Al iniciar la sesión, el sistema evalúa y resuelve recursivamente todos los permisos efectivos que posee el usuario, recorriendo la estructura de árbol y acumulando las patentes sin duplicados en el SessionManager.</w:t>
+        <w:t>La asignación de permisos se vincula directamente entre la entidad Usuario y la clase ComponentePermiso (relación de muchos a muchos). Al iniciar la sesión, el sistema evalúa y resuelve recursivamente todos los permisos efectivos que posee el usuario, recorriendo la estructura de árbol y acumulando las patentes sin duplicados en el SessionManager.</w:t>
       </w:r>
     </w:p>
     <w:p/>
     <w:p>
       <w:r>
-        <w:t xml:space="preserve">En la interfaz gráfica, se utiliza una función recursiva que recorre el árbol de permisos del Composite y lo representa visualmente en un control </w:t>
-      </w:r>
-      <w:proofErr w:type="spellStart"/>
-      <w:r>
-        <w:t>TreeView</w:t>
-      </w:r>
-      <w:proofErr w:type="spellEnd"/>
-      <w:r>
-        <w:t xml:space="preserve"> de Windows </w:t>
-      </w:r>
-      <w:proofErr w:type="spellStart"/>
-      <w:r>
-        <w:t>Forms</w:t>
-      </w:r>
-      <w:proofErr w:type="spellEnd"/>
-      <w:r>
-        <w:t xml:space="preserve">. Adicionalmente, el sistema permite quitar permisos del usuario seleccionándolos directamente desde el árbol gráfico en el formulario </w:t>
-      </w:r>
-      <w:proofErr w:type="spellStart"/>
-      <w:r>
-        <w:t>MisPermisosForm</w:t>
-      </w:r>
-      <w:proofErr w:type="spellEnd"/>
-      <w:r>
-        <w:t>.</w:t>
+        <w:t>En la interfaz gráfica, se utiliza una función recursiva que recorre el árbol de permisos del Composite y lo representa visualmente en un control TreeView de Windows Forms. Adicionalmente, el sistema permite quitar permisos del usuario seleccionándolos directamente desde el árbol gráfico en el formulario MisPermisosForm.</w:t>
       </w:r>
     </w:p>
     <w:p/>
@@ -11232,23 +11066,7 @@
     </w:p>
     <w:p>
       <w:r>
-        <w:t xml:space="preserve">[Diagrama de clases UML que representa el patrón Composite: </w:t>
-      </w:r>
-      <w:proofErr w:type="spellStart"/>
-      <w:r>
-        <w:t>ComponentePermiso</w:t>
-      </w:r>
-      <w:proofErr w:type="spellEnd"/>
-      <w:r>
-        <w:t xml:space="preserve"> como componente base, Familia como contenedor y Patente como hoja. Se incluye la asociación con la entidad Usuario y la tabla relacional intermedia </w:t>
-      </w:r>
-      <w:proofErr w:type="spellStart"/>
-      <w:r>
-        <w:t>Usuario_Permiso</w:t>
-      </w:r>
-      <w:proofErr w:type="spellEnd"/>
-      <w:r>
-        <w:t xml:space="preserve"> en el DER].</w:t>
+        <w:t>[Diagrama de clases UML que representa el patrón Composite: ComponentePermiso como componente base, Familia como contenedor y Patente como hoja. Se incluye la asociación con la entidad Usuario y la tabla relacional intermedia Usuario_Permiso en el DER].</w:t>
       </w:r>
     </w:p>
     <w:p/>
@@ -11297,112 +11115,25 @@
     <w:p/>
     <w:p>
       <w:r>
-        <w:t xml:space="preserve">1. </w:t>
-      </w:r>
-      <w:proofErr w:type="spellStart"/>
-      <w:r>
-        <w:t>IObserver</w:t>
-      </w:r>
-      <w:proofErr w:type="spellEnd"/>
-      <w:r>
-        <w:t xml:space="preserve">: Interfaz implementada por los elementos que necesitan actualizar su idioma de forma activa (los formularios de la GUI). Define el método </w:t>
-      </w:r>
-      <w:proofErr w:type="spellStart"/>
-      <w:proofErr w:type="gramStart"/>
-      <w:r>
-        <w:t>ActualizarIdioma</w:t>
-      </w:r>
-      <w:proofErr w:type="spellEnd"/>
-      <w:r>
-        <w:t>(</w:t>
-      </w:r>
-      <w:proofErr w:type="gramEnd"/>
-      <w:r>
-        <w:t>).</w:t>
+        <w:t>1. IObserver: Interfaz implementada por los elementos que necesitan actualizar su idioma de forma activa (los formularios de la GUI). Define el método ActualizarIdioma().</w:t>
       </w:r>
     </w:p>
     <w:p/>
     <w:p>
       <w:r>
-        <w:t xml:space="preserve">2. </w:t>
-      </w:r>
-      <w:proofErr w:type="spellStart"/>
-      <w:r>
-        <w:t>ISubject</w:t>
-      </w:r>
-      <w:proofErr w:type="spellEnd"/>
-      <w:r>
-        <w:t xml:space="preserve"> (o </w:t>
-      </w:r>
-      <w:proofErr w:type="spellStart"/>
-      <w:r>
-        <w:t>IManejadorIdioma</w:t>
-      </w:r>
-      <w:proofErr w:type="spellEnd"/>
-      <w:r>
-        <w:t>): Mantiene la lista de observadores registrados, el idioma actual de la sesión y notifica a los observadores cuando este cambia.</w:t>
+        <w:t>2. ISubject (o IManejadorIdioma): Mantiene la lista de observadores registrados, el idioma actual de la sesión y notifica a los observadores cuando este cambia.</w:t>
       </w:r>
     </w:p>
     <w:p/>
     <w:p>
       <w:r>
-        <w:t xml:space="preserve">Al cargarse un formulario en la GUI, este se registra como observador en el </w:t>
-      </w:r>
-      <w:proofErr w:type="spellStart"/>
-      <w:r>
-        <w:t>ManejadorIdioma</w:t>
-      </w:r>
-      <w:proofErr w:type="spellEnd"/>
-      <w:r>
-        <w:t xml:space="preserve"> (Singleton de la capa de Servicios). El manejador lee las leyendas desde la base de datos (tablas Idioma y </w:t>
-      </w:r>
-      <w:proofErr w:type="spellStart"/>
-      <w:r>
-        <w:t>Traduccion</w:t>
-      </w:r>
-      <w:proofErr w:type="spellEnd"/>
-      <w:r>
-        <w:t>) para el idioma seleccionado y las guarda en un diccionario en memoria.</w:t>
+        <w:t>Al cargarse un formulario en la GUI, este se registra como observador en el ManejadorIdioma (Singleton de la capa de Servicios). El manejador lee las leyendas desde la base de datos (tablas Idioma y Traduccion) para el idioma seleccionado y las guarda en un diccionario en memoria.</w:t>
       </w:r>
     </w:p>
     <w:p/>
     <w:p>
       <w:r>
-        <w:t xml:space="preserve">Cuando el usuario selecciona un idioma diferente desde el Menú de la aplicación, el </w:t>
-      </w:r>
-      <w:proofErr w:type="spellStart"/>
-      <w:r>
-        <w:t>ManejadorIdioma</w:t>
-      </w:r>
-      <w:proofErr w:type="spellEnd"/>
-      <w:r>
-        <w:t xml:space="preserve"> cambia el idioma activo, recarga las traducciones y llama al método </w:t>
-      </w:r>
-      <w:proofErr w:type="spellStart"/>
-      <w:proofErr w:type="gramStart"/>
-      <w:r>
-        <w:t>Notify</w:t>
-      </w:r>
-      <w:proofErr w:type="spellEnd"/>
-      <w:r>
-        <w:t>(</w:t>
-      </w:r>
-      <w:proofErr w:type="gramEnd"/>
-      <w:r>
-        <w:t xml:space="preserve">). Este recorre la lista de observadores activos llamando a </w:t>
-      </w:r>
-      <w:proofErr w:type="spellStart"/>
-      <w:proofErr w:type="gramStart"/>
-      <w:r>
-        <w:t>ActualizarIdioma</w:t>
-      </w:r>
-      <w:proofErr w:type="spellEnd"/>
-      <w:r>
-        <w:t>(</w:t>
-      </w:r>
-      <w:proofErr w:type="gramEnd"/>
-      <w:r>
-        <w:t xml:space="preserve">) en cada </w:t>
+        <w:t xml:space="preserve">Cuando el usuario selecciona un idioma diferente desde el Menú de la aplicación, el ManejadorIdioma cambia el idioma activo, recarga las traducciones y llama al método Notify(). Este recorre la lista de observadores activos llamando a ActualizarIdioma() en cada </w:t>
       </w:r>
       <w:r>
         <w:lastRenderedPageBreak/>
@@ -11426,39 +11157,7 @@
     </w:p>
     <w:p>
       <w:r>
-        <w:t xml:space="preserve">[Diagrama de clases UML que muestra las interfaces </w:t>
-      </w:r>
-      <w:proofErr w:type="spellStart"/>
-      <w:r>
-        <w:t>ISubject</w:t>
-      </w:r>
-      <w:proofErr w:type="spellEnd"/>
-      <w:r>
-        <w:t xml:space="preserve"> e </w:t>
-      </w:r>
-      <w:proofErr w:type="spellStart"/>
-      <w:r>
-        <w:t>IObserver</w:t>
-      </w:r>
-      <w:proofErr w:type="spellEnd"/>
-      <w:r>
-        <w:t xml:space="preserve"> de Abstracciones, la implementación concreta </w:t>
-      </w:r>
-      <w:proofErr w:type="spellStart"/>
-      <w:r>
-        <w:t>ManejadorIdioma</w:t>
-      </w:r>
-      <w:proofErr w:type="spellEnd"/>
-      <w:r>
-        <w:t xml:space="preserve"> en Servicios y cómo los formularios GUI implementan </w:t>
-      </w:r>
-      <w:proofErr w:type="spellStart"/>
-      <w:r>
-        <w:t>IObserver</w:t>
-      </w:r>
-      <w:proofErr w:type="spellEnd"/>
-      <w:r>
-        <w:t xml:space="preserve"> para recibir las notificaciones de cambio de idioma].</w:t>
+        <w:t>[Diagrama de clases UML que muestra las interfaces ISubject e IObserver de Abstracciones, la implementación concreta ManejadorIdioma en Servicios y cómo los formularios GUI implementan IObserver para recibir las notificaciones de cambio de idioma].</w:t>
       </w:r>
     </w:p>
     <w:p/>
@@ -11675,15 +11374,7 @@
         </w:numPr>
       </w:pPr>
       <w:r>
-        <w:t xml:space="preserve">Botón Limpiar: </w:t>
-      </w:r>
-      <w:proofErr w:type="gramStart"/>
-      <w:r>
-        <w:t>resetea</w:t>
-      </w:r>
-      <w:proofErr w:type="gramEnd"/>
-      <w:r>
-        <w:t xml:space="preserve"> todos los filtros y muestra </w:t>
+        <w:t xml:space="preserve">Botón Limpiar: resetea todos los filtros y muestra </w:t>
       </w:r>
       <w:r>
         <w:t xml:space="preserve">la </w:t>
@@ -12323,20 +12014,36 @@
           <w:p>
             <w:r>
               <w:t>3.1.1. El usuario presiona el botón 'Limpiar':</w:t>
+            </w:r>
+            <w:r>
               <w:br/>
               <w:t>3.1.2. El sistema vacía los filtros y muestra todos los registros en la grilla.</w:t>
+            </w:r>
+            <w:r>
               <w:br/>
               <w:t>3.1.3. Retorna al paso 3 del escenario principal.</w:t>
+            </w:r>
+            <w:r>
               <w:br/>
               <w:t>3.2.1. Ningún registro coincide con los criterios de filtrado:</w:t>
+            </w:r>
+            <w:r>
               <w:br/>
               <w:t>3.2.2. El sistema muestra la grilla vacía.</w:t>
+            </w:r>
+            <w:r>
               <w:br/>
               <w:t>3.2.3. Continúa en el paso 3 del escenario principal.</w:t>
+            </w:r>
+            <w:r>
               <w:br/>
               <w:t>4.1.1. Ocurre un error al consultar los datos:</w:t>
+            </w:r>
+            <w:r>
               <w:br/>
               <w:t>4.1.2. El sistema muestra un mensaje de error.</w:t>
+            </w:r>
+            <w:r>
               <w:br/>
               <w:t>4.1.3. El flujo finaliza.</w:t>
             </w:r>
@@ -12563,23 +12270,7 @@
     </w:p>
     <w:p>
       <w:r>
-        <w:t xml:space="preserve">Cada vez que se modifica un registro de usuario en BLL (cambio de estado, contraseña o permisos), el método correspondiente invoca a </w:t>
-      </w:r>
-      <w:proofErr w:type="spellStart"/>
-      <w:r>
-        <w:t>VersionUsuarioBLL</w:t>
-      </w:r>
-      <w:proofErr w:type="spellEnd"/>
-      <w:r>
-        <w:t xml:space="preserve">. Se captura el estado del objeto Usuario, se asocia el ID del usuario que realizó la modificación y la fecha actual, y se guarda en la tabla de base de datos </w:t>
-      </w:r>
-      <w:proofErr w:type="spellStart"/>
-      <w:r>
-        <w:t>VersionUsuario</w:t>
-      </w:r>
-      <w:proofErr w:type="spellEnd"/>
-      <w:r>
-        <w:t>.</w:t>
+        <w:t>Cada vez que se modifica un registro de usuario en BLL (cambio de estado, contraseña o permisos), el método correspondiente invoca a VersionUsuarioBLL. Se captura el estado del objeto Usuario, se asocia el ID del usuario que realizó la modificación y la fecha actual, y se guarda en la tabla de base de datos VersionUsuario.</w:t>
       </w:r>
     </w:p>
     <w:p/>
@@ -12636,61 +12327,19 @@
     </w:p>
     <w:p>
       <w:r>
-        <w:t xml:space="preserve">El flujo de Backup y Restauración segura se implementa en la clase </w:t>
-      </w:r>
-      <w:proofErr w:type="spellStart"/>
-      <w:r>
-        <w:t>BackupService</w:t>
-      </w:r>
-      <w:proofErr w:type="spellEnd"/>
-      <w:r>
-        <w:t xml:space="preserve"> en la capa Servicios, interactuando con la base de datos y el sistema de archivos local:</w:t>
+        <w:t>El flujo de Backup y Restauración segura se implementa en la clase BackupService en la capa Servicios, interactuando con la base de datos y el sistema de archivos local:</w:t>
       </w:r>
     </w:p>
     <w:p/>
     <w:p>
       <w:r>
-        <w:t xml:space="preserve">1. Generación de Copia de Seguridad: El sistema solicita una contraseña privada al administrador. Se realiza </w:t>
-      </w:r>
-      <w:proofErr w:type="gramStart"/>
-      <w:r>
-        <w:t xml:space="preserve">un </w:t>
-      </w:r>
-      <w:proofErr w:type="spellStart"/>
-      <w:r>
-        <w:t>backup</w:t>
-      </w:r>
-      <w:proofErr w:type="spellEnd"/>
-      <w:proofErr w:type="gramEnd"/>
-      <w:r>
-        <w:t xml:space="preserve"> nativo de SQL Server hacia un archivo .</w:t>
-      </w:r>
-      <w:proofErr w:type="spellStart"/>
-      <w:r>
-        <w:t>bak</w:t>
-      </w:r>
-      <w:proofErr w:type="spellEnd"/>
-      <w:r>
-        <w:t xml:space="preserve"> plano temporal. Inmediatamente, la aplicación lee el archivo temporal, lo cifra en bloques utilizando AES-256 (modo CBC, con vector de inicialización e iteraciones de derivación PBKDF2), genera el archivo resguardado final con </w:t>
-      </w:r>
-      <w:r>
-        <w:t xml:space="preserve">extensión. </w:t>
-      </w:r>
-      <w:proofErr w:type="spellStart"/>
-      <w:r>
-        <w:t>stachbak</w:t>
-      </w:r>
-      <w:proofErr w:type="spellEnd"/>
-      <w:r>
-        <w:t xml:space="preserve"> y finalmente destruye físicamente (tritura) el archivo .</w:t>
-      </w:r>
-      <w:proofErr w:type="spellStart"/>
-      <w:r>
-        <w:t>bak</w:t>
-      </w:r>
-      <w:proofErr w:type="spellEnd"/>
-      <w:r>
-        <w:t xml:space="preserve"> plano temporal del disco.</w:t>
+        <w:t xml:space="preserve">1. Generación de Copia de Seguridad: El sistema solicita una contraseña privada al administrador. Se realiza un backup nativo de SQL Server hacia un archivo .bak plano temporal. Inmediatamente, la aplicación lee el archivo temporal, lo cifra en bloques utilizando AES-256 (modo CBC, con vector de inicialización e iteraciones de derivación PBKDF2), genera el archivo resguardado final con </w:t>
+      </w:r>
+      <w:r>
+        <w:t>extensión. stachbak</w:t>
+      </w:r>
+      <w:r>
+        <w:t xml:space="preserve"> y finalmente destruye físicamente (tritura) el archivo .bak plano temporal del disco.</w:t>
       </w:r>
     </w:p>
     <w:p/>
@@ -12699,82 +12348,16 @@
         <w:t xml:space="preserve">2. Restauración de Copia de Seguridad: El administrador ingresa la contraseña de cifrado. El sistema valida la </w:t>
       </w:r>
       <w:r>
-        <w:t xml:space="preserve">extensión. </w:t>
-      </w:r>
-      <w:proofErr w:type="spellStart"/>
-      <w:r>
-        <w:t>stachbak</w:t>
-      </w:r>
-      <w:proofErr w:type="spellEnd"/>
-      <w:r>
-        <w:t>, descifra el contenido hacia un archivo .</w:t>
-      </w:r>
-      <w:proofErr w:type="spellStart"/>
-      <w:r>
-        <w:t>bak</w:t>
-      </w:r>
-      <w:proofErr w:type="spellEnd"/>
-      <w:r>
-        <w:t xml:space="preserve"> plano temporal, invoca la restauración nativa en el servidor SQL y elimina de inmediato el archivo temporal.</w:t>
+        <w:t>extensión. stachbak</w:t>
+      </w:r>
+      <w:r>
+        <w:t>, descifra el contenido hacia un archivo .bak plano temporal, invoca la restauración nativa en el servidor SQL y elimina de inmediato el archivo temporal.</w:t>
       </w:r>
     </w:p>
     <w:p/>
     <w:p>
       <w:r>
-        <w:t>3. Clave de Recuperación Maestra: Al iniciar el sistema (</w:t>
-      </w:r>
-      <w:proofErr w:type="spellStart"/>
-      <w:r>
-        <w:t>Program.cs</w:t>
-      </w:r>
-      <w:proofErr w:type="spellEnd"/>
-      <w:r>
-        <w:t xml:space="preserve">), se genera una clave maestra de recuperación de emergencia y se guarda </w:t>
-      </w:r>
-      <w:proofErr w:type="spellStart"/>
-      <w:r>
-        <w:t>hasheada</w:t>
-      </w:r>
-      <w:proofErr w:type="spellEnd"/>
-      <w:r>
-        <w:t xml:space="preserve"> en </w:t>
-      </w:r>
-      <w:proofErr w:type="spellStart"/>
-      <w:r>
-        <w:t>App.config</w:t>
-      </w:r>
-      <w:proofErr w:type="spellEnd"/>
-      <w:r>
-        <w:t xml:space="preserve">. La sección se protege criptográficamente usando el proveedor DPAPI (Data </w:t>
-      </w:r>
-      <w:proofErr w:type="spellStart"/>
-      <w:r>
-        <w:t>Protection</w:t>
-      </w:r>
-      <w:proofErr w:type="spellEnd"/>
-      <w:r>
-        <w:t xml:space="preserve"> API) de Windows. Esta clave permite a un administrador saltar (</w:t>
-      </w:r>
-      <w:proofErr w:type="gramStart"/>
-      <w:r>
-        <w:t>bypass</w:t>
-      </w:r>
-      <w:proofErr w:type="gramEnd"/>
-      <w:r>
-        <w:t xml:space="preserve">) la validación de base de datos ante errores graves de conexión o integridad y acceder directamente a restaurar </w:t>
-      </w:r>
-      <w:proofErr w:type="gramStart"/>
-      <w:r>
-        <w:t xml:space="preserve">un </w:t>
-      </w:r>
-      <w:proofErr w:type="spellStart"/>
-      <w:r>
-        <w:t>backup</w:t>
-      </w:r>
-      <w:proofErr w:type="spellEnd"/>
-      <w:proofErr w:type="gramEnd"/>
-      <w:r>
-        <w:t xml:space="preserve"> íntegro.</w:t>
+        <w:t>3. Clave de Recuperación Maestra: Al iniciar el sistema (Program.cs), se genera una clave maestra de recuperación de emergencia y se guarda hasheada en App.config. La sección se protege criptográficamente usando el proveedor DPAPI (Data Protection API) de Windows. Esta clave permite a un administrador saltar (bypass) la validación de base de datos ante errores graves de conexión o integridad y acceder directamente a restaurar un backup íntegro.</w:t>
       </w:r>
     </w:p>
     <w:p/>
@@ -12822,43 +12405,19 @@
     <w:p/>
     <w:p>
       <w:r>
-        <w:t xml:space="preserve">1. Dígito Verificador Horizontal (DVH): Es un hash SHA-256 que se calcula sobre los atributos críticos de cada registro de usuario (ID, username cifrado, contraseña </w:t>
-      </w:r>
-      <w:proofErr w:type="spellStart"/>
-      <w:r>
-        <w:t>hasheada</w:t>
-      </w:r>
-      <w:proofErr w:type="spellEnd"/>
-      <w:r>
-        <w:t>, estado). Para detectar el intercambio de registros, en el cálculo participa la posición del carácter y la posición del atributo. Se almacena en una columna específica del mismo registro.</w:t>
+        <w:t>1. Dígito Verificador Horizontal (DVH): Es un hash SHA-256 que se calcula sobre los atributos críticos de cada registro de usuario (ID, username cifrado, contraseña hasheada, estado). Para detectar el intercambio de registros, en el cálculo participa la posición del carácter y la posición del atributo. Se almacena en una columna específica del mismo registro.</w:t>
       </w:r>
     </w:p>
     <w:p/>
     <w:p>
       <w:r>
-        <w:t xml:space="preserve">2. Dígito Verificador Vertical (DVV): Es un hash calculado sobre la suma/concatenación de todos los DVH individuales de la tabla en cuestión. Se almacena en la tabla separada llamada </w:t>
-      </w:r>
-      <w:proofErr w:type="spellStart"/>
-      <w:r>
-        <w:t>DigitoVerificador</w:t>
-      </w:r>
-      <w:proofErr w:type="spellEnd"/>
-      <w:r>
-        <w:t xml:space="preserve"> en la base de datos.</w:t>
+        <w:t>2. Dígito Verificador Vertical (DVV): Es un hash calculado sobre la suma/concatenación de todos los DVH individuales de la tabla en cuestión. Se almacena en la tabla separada llamada DigitoVerificador en la base de datos.</w:t>
       </w:r>
     </w:p>
     <w:p/>
     <w:p>
       <w:r>
-        <w:t>Verificación en Arranque: Al arrancar el sistema (</w:t>
-      </w:r>
-      <w:proofErr w:type="spellStart"/>
-      <w:r>
-        <w:t>Program.cs</w:t>
-      </w:r>
-      <w:proofErr w:type="spellEnd"/>
-      <w:r>
-        <w:t>) y antes de mostrar el Login, se recalculan y verifican los DVH y el DVV de la tabla Usuario. Si se detectan inconsistencias (registros faltantes, agregados por fuera, o modificados directamente en la base de datos), la aplicación bloquea el ingreso regular y abre de forma obligatoria el panel de restauración de emergencia, solicitando credenciales válidas o la Clave de Recuperación Maestra.</w:t>
+        <w:t>Verificación en Arranque: Al arrancar el sistema (Program.cs) y antes de mostrar el Login, se recalculan y verifican los DVH y el DVV de la tabla Usuario. Si se detectan inconsistencias (registros faltantes, agregados por fuera, o modificados directamente en la base de datos), la aplicación bloquea el ingreso regular y abre de forma obligatoria el panel de restauración de emergencia, solicitando credenciales válidas o la Clave de Recuperación Maestra.</w:t>
       </w:r>
     </w:p>
     <w:p/>

</xml_diff>